<commit_message>
Meeting 4 agenda: bundle the readiness checklist into the agenda download
The Meeting 4 agenda (PDF + Word) is now a two-page handout — agenda on page 1,
readiness checklist on page 2 — so the step that says 'work the checklist on the
back of this agenda' matches the download.

Co-Authored-By: Claude Opus 4.8 <noreply@anthropic.com>
</commit_message>
<xml_diff>
--- a/public/agendas/ems-meeting-4-agenda.docx
+++ b/public/agendas/ems-meeting-4-agenda.docx
@@ -4,13 +4,12 @@
   <w:body>
     <w:p>
       <w:pPr>
-        <w:spacing w:after="30"/>
-        <w:jc w:val="center"/>
+        <w:spacing w:after="40"/>
       </w:pPr>
       <w:r>
         <w:drawing>
           <wp:inline distT="0" distB="0" distL="0" distR="0">
-            <wp:extent cx="571500" cy="371475"/>
+            <wp:extent cx="438150" cy="438150"/>
             <wp:effectExtent t="0" r="0" b="0" l="0"/>
             <wp:docPr id="1" name="" descr="" title=""/>
             <wp:cNvGraphicFramePr>
@@ -35,7 +34,7 @@
                   <pic:spPr bwMode="auto">
                     <a:xfrm>
                       <a:off x="0" y="0"/>
-                      <a:ext cx="571500" cy="371475"/>
+                      <a:ext cx="438150" cy="438150"/>
                     </a:xfrm>
                     <a:prstGeom prst="rect">
                       <a:avLst/>
@@ -50,8 +49,7 @@
     </w:p>
     <w:p>
       <w:pPr>
-        <w:spacing w:after="30"/>
-        <w:jc w:val="center"/>
+        <w:spacing w:after="20"/>
       </w:pPr>
       <w:r>
         <w:rPr>
@@ -59,8 +57,9 @@
           <w:b/>
           <w:bCs/>
           <w:color w:val="9B2C2C"/>
-          <w:sz w:val="15"/>
-          <w:szCs w:val="15"/>
+          <w:spacing w:val="8"/>
+          <w:sz w:val="16"/>
+          <w:szCs w:val="16"/>
         </w:rPr>
         <w:t xml:space="preserve">ELSINORE MIDDLE SCHOOL · MEETING 4 OF 18 · AGENDA</w:t>
       </w:r>
@@ -68,7 +67,6 @@
     <w:p>
       <w:pPr>
         <w:spacing w:after="20"/>
-        <w:jc w:val="center"/>
       </w:pPr>
       <w:r>
         <w:rPr>
@@ -84,24 +82,25 @@
     </w:p>
     <w:p>
       <w:pPr>
-        <w:spacing w:after="170"/>
-        <w:jc w:val="center"/>
-      </w:pPr>
-      <w:r>
-        <w:rPr>
-          <w:rFonts w:ascii="Calibri" w:cs="Calibri" w:eastAsia="Calibri" w:hAnsi="Calibri"/>
-          <w:i/>
-          <w:iCs/>
+        <w:pBdr>
+          <w:bottom w:val="single" w:color="9B2C2C" w:sz="14" w:space="6"/>
+        </w:pBdr>
+        <w:spacing w:after="120"/>
+      </w:pPr>
+      <w:r>
+        <w:rPr>
+          <w:rFonts w:ascii="Calibri" w:cs="Calibri" w:eastAsia="Calibri" w:hAnsi="Calibri"/>
           <w:color w:val="64748B"/>
-          <w:sz w:val="23"/>
-          <w:szCs w:val="23"/>
+          <w:sz w:val="22"/>
+          <w:szCs w:val="22"/>
         </w:rPr>
         <w:t xml:space="preserve">Buffer meeting for culture, clarity, and questions.</w:t>
       </w:r>
     </w:p>
     <w:p>
       <w:pPr>
-        <w:spacing w:after="90" w:before="220"/>
+        <w:keepNext/>
+        <w:spacing w:after="80" w:before="200"/>
       </w:pPr>
       <w:r>
         <w:rPr>
@@ -109,15 +108,15 @@
           <w:b/>
           <w:bCs/>
           <w:color w:val="9B2C2C"/>
-          <w:sz w:val="26"/>
-          <w:szCs w:val="26"/>
+          <w:sz w:val="25"/>
+          <w:szCs w:val="25"/>
         </w:rPr>
         <w:t xml:space="preserve">Why this meeting matters</w:t>
       </w:r>
     </w:p>
     <w:p>
       <w:pPr>
-        <w:spacing w:after="90"/>
+        <w:spacing w:after="120"/>
       </w:pPr>
       <w:r>
         <w:rPr>
@@ -131,7 +130,7 @@
     </w:p>
     <w:p>
       <w:pPr>
-        <w:spacing w:after="90"/>
+        <w:spacing w:after="120"/>
       </w:pPr>
       <w:r>
         <w:rPr>
@@ -140,38 +139,24 @@
           <w:sz w:val="22"/>
           <w:szCs w:val="22"/>
         </w:rPr>
-        <w:t xml:space="preserve">It's also where the Meeting 2 foundation gets finished: refine your roles and norms and complete the accountability worksheet, so the way your team works is settled before the learning cycle begins.</w:t>
-      </w:r>
-    </w:p>
-    <w:p>
-      <w:pPr>
-        <w:spacing w:after="90"/>
-      </w:pPr>
-      <w:r>
-        <w:rPr>
-          <w:rFonts w:ascii="Calibri" w:cs="Calibri" w:eastAsia="Calibri" w:hAnsi="Calibri"/>
-          <w:color w:val="1F2933"/>
-          <w:sz w:val="22"/>
-          <w:szCs w:val="22"/>
-        </w:rPr>
-        <w:t xml:space="preserve">Then the team confirms it's ready: work through the readiness checklist on the back of the agenda, check off every task from Meetings 1–4, and use the remaining time to close any gaps — finishing incomplete foundation work is exactly what this buffer is for. The four critical questions aren't self-assessed here; teams meet them as the cycle unfolds, and give the honest, experience-based read at the end of the year (Meeting 18). The standards work itself begins next time, at Meeting 5.</w:t>
+        <w:t xml:space="preserve">It's also where the Meeting 2 foundation gets finished: refine your roles and norms and complete the accountability worksheet, so the way your team works is settled before the learning cycle begins. The four critical questions aren't self-assessed here — teams meet them as the cycle unfolds and give the honest read at the end of the year (Meeting 18).</w:t>
       </w:r>
     </w:p>
     <w:tbl>
       <w:tblPr>
         <w:tblW w:type="dxa" w:w="9360"/>
         <w:tblBorders>
-          <w:top w:val="single" w:color="auto" w:sz="4"/>
-          <w:left w:val="single" w:color="auto" w:sz="4"/>
-          <w:bottom w:val="single" w:color="auto" w:sz="4"/>
-          <w:right w:val="single" w:color="auto" w:sz="4"/>
-          <w:insideH w:val="single" w:color="auto" w:sz="4"/>
-          <w:insideV w:val="single" w:color="auto" w:sz="4"/>
+          <w:top w:val="single" w:color="E5E7EB" w:sz="4"/>
+          <w:left w:val="single" w:color="E5E7EB" w:sz="4"/>
+          <w:bottom w:val="single" w:color="E5E7EB" w:sz="4"/>
+          <w:right w:val="single" w:color="E5E7EB" w:sz="4"/>
+          <w:insideH w:val="single" w:color="E5E7EB" w:sz="4"/>
+          <w:insideV w:val="single" w:color="E5E7EB" w:sz="4"/>
         </w:tblBorders>
       </w:tblPr>
       <w:tblGrid>
-        <w:gridCol w:w="1872"/>
-        <w:gridCol w:w="7488"/>
+        <w:gridCol w:w="2059"/>
+        <w:gridCol w:w="7301"/>
       </w:tblGrid>
       <w:tr>
         <w:trPr>
@@ -179,19 +164,13 @@
         </w:trPr>
         <w:tc>
           <w:tcPr>
-            <w:tcW w:type="dxa" w:w="1872"/>
-            <w:tcBorders>
-              <w:top w:val="single" w:color="E2E2E2" w:sz="4"/>
-              <w:left w:val="single" w:color="E2E2E2" w:sz="4"/>
-              <w:bottom w:val="single" w:color="E2E2E2" w:sz="4"/>
-              <w:right w:val="single" w:color="E2E2E2" w:sz="4"/>
-            </w:tcBorders>
+            <w:tcW w:type="dxa" w:w="2059"/>
             <w:shd w:fill="9B2C2C" w:color="auto" w:val="clear"/>
             <w:tcMar>
-              <w:top w:type="dxa" w:w="60"/>
-              <w:left w:type="dxa" w:w="100"/>
-              <w:bottom w:type="dxa" w:w="60"/>
-              <w:right w:type="dxa" w:w="100"/>
+              <w:top w:type="dxa" w:w="90"/>
+              <w:left w:type="dxa" w:w="110"/>
+              <w:bottom w:type="dxa" w:w="90"/>
+              <w:right w:type="dxa" w:w="110"/>
             </w:tcMar>
           </w:tcPr>
           <w:p>
@@ -210,19 +189,13 @@
         </w:tc>
         <w:tc>
           <w:tcPr>
-            <w:tcW w:type="dxa" w:w="7488"/>
-            <w:tcBorders>
-              <w:top w:val="single" w:color="E2E2E2" w:sz="4"/>
-              <w:left w:val="single" w:color="E2E2E2" w:sz="4"/>
-              <w:bottom w:val="single" w:color="E2E2E2" w:sz="4"/>
-              <w:right w:val="single" w:color="E2E2E2" w:sz="4"/>
-            </w:tcBorders>
+            <w:tcW w:type="dxa" w:w="7301"/>
             <w:shd w:fill="9B2C2C" w:color="auto" w:val="clear"/>
             <w:tcMar>
-              <w:top w:type="dxa" w:w="60"/>
-              <w:left w:type="dxa" w:w="100"/>
-              <w:bottom w:type="dxa" w:w="60"/>
-              <w:right w:type="dxa" w:w="100"/>
+              <w:top w:type="dxa" w:w="90"/>
+              <w:left w:type="dxa" w:w="110"/>
+              <w:bottom w:type="dxa" w:w="90"/>
+              <w:right w:type="dxa" w:w="110"/>
             </w:tcMar>
           </w:tcPr>
           <w:p>
@@ -242,34 +215,32 @@
       </w:tr>
       <w:tr>
         <w:trPr>
-          <w:trHeight w:val="560" w:hRule="atLeast"/>
+          <w:cantSplit/>
         </w:trPr>
         <w:tc>
           <w:tcPr>
-            <w:tcW w:type="dxa" w:w="1872"/>
-            <w:tcBorders>
-              <w:top w:val="single" w:color="E2E2E2" w:sz="4"/>
-              <w:left w:val="single" w:color="E2E2E2" w:sz="4"/>
-              <w:bottom w:val="single" w:color="E2E2E2" w:sz="4"/>
-              <w:right w:val="single" w:color="E2E2E2" w:sz="4"/>
-            </w:tcBorders>
+            <w:tcW w:type="dxa" w:w="2059"/>
             <w:shd w:fill="F7ECEC" w:color="auto" w:val="clear"/>
             <w:tcMar>
-              <w:top w:type="dxa" w:w="60"/>
-              <w:left w:type="dxa" w:w="100"/>
-              <w:bottom w:type="dxa" w:w="60"/>
-              <w:right w:type="dxa" w:w="100"/>
-            </w:tcMar>
-          </w:tcPr>
-          <w:p>
+              <w:top w:type="dxa" w:w="90"/>
+              <w:left w:type="dxa" w:w="110"/>
+              <w:bottom w:type="dxa" w:w="90"/>
+              <w:right w:type="dxa" w:w="110"/>
+            </w:tcMar>
+            <w:vAlign w:val="top"/>
+          </w:tcPr>
+          <w:p>
+            <w:pPr>
+              <w:spacing w:after="20"/>
+            </w:pPr>
             <w:r>
               <w:rPr>
                 <w:rFonts w:ascii="Calibri" w:cs="Calibri" w:eastAsia="Calibri" w:hAnsi="Calibri"/>
                 <w:b/>
                 <w:bCs/>
-                <w:color w:val="7A2626"/>
-                <w:sz w:val="22"/>
-                <w:szCs w:val="22"/>
+                <w:color w:val="1F2933"/>
+                <w:sz w:val="21"/>
+                <w:szCs w:val="21"/>
               </w:rPr>
               <w:t xml:space="preserve">Focus</w:t>
             </w:r>
@@ -277,27 +248,27 @@
         </w:tc>
         <w:tc>
           <w:tcPr>
-            <w:tcW w:type="dxa" w:w="7488"/>
-            <w:tcBorders>
-              <w:top w:val="single" w:color="E2E2E2" w:sz="4"/>
-              <w:left w:val="single" w:color="E2E2E2" w:sz="4"/>
-              <w:bottom w:val="single" w:color="E2E2E2" w:sz="4"/>
-              <w:right w:val="single" w:color="E2E2E2" w:sz="4"/>
-            </w:tcBorders>
-            <w:tcMar>
-              <w:top w:type="dxa" w:w="60"/>
-              <w:left w:type="dxa" w:w="100"/>
-              <w:bottom w:type="dxa" w:w="60"/>
-              <w:right w:type="dxa" w:w="100"/>
-            </w:tcMar>
-          </w:tcPr>
-          <w:p>
-            <w:r>
-              <w:rPr>
-                <w:rFonts w:ascii="Calibri" w:cs="Calibri" w:eastAsia="Calibri" w:hAnsi="Calibri"/>
+            <w:tcW w:type="dxa" w:w="7301"/>
+            <w:tcMar>
+              <w:top w:type="dxa" w:w="90"/>
+              <w:left w:type="dxa" w:w="110"/>
+              <w:bottom w:type="dxa" w:w="90"/>
+              <w:right w:type="dxa" w:w="110"/>
+            </w:tcMar>
+            <w:vAlign w:val="top"/>
+          </w:tcPr>
+          <w:p>
+            <w:pPr>
+              <w:spacing w:after="20"/>
+            </w:pPr>
+            <w:r>
+              <w:rPr>
+                <w:rFonts w:ascii="Calibri" w:cs="Calibri" w:eastAsia="Calibri" w:hAnsi="Calibri"/>
+                <w:b w:val="false"/>
+                <w:bCs w:val="false"/>
                 <w:color w:val="1F2933"/>
-                <w:sz w:val="22"/>
-                <w:szCs w:val="22"/>
+                <w:sz w:val="21"/>
+                <w:szCs w:val="21"/>
               </w:rPr>
               <w:t xml:space="preserve">Are we ready to begin the actual learning cycle?</w:t>
             </w:r>
@@ -306,34 +277,32 @@
       </w:tr>
       <w:tr>
         <w:trPr>
-          <w:trHeight w:val="560" w:hRule="atLeast"/>
+          <w:cantSplit/>
         </w:trPr>
         <w:tc>
           <w:tcPr>
-            <w:tcW w:type="dxa" w:w="1872"/>
-            <w:tcBorders>
-              <w:top w:val="single" w:color="E2E2E2" w:sz="4"/>
-              <w:left w:val="single" w:color="E2E2E2" w:sz="4"/>
-              <w:bottom w:val="single" w:color="E2E2E2" w:sz="4"/>
-              <w:right w:val="single" w:color="E2E2E2" w:sz="4"/>
-            </w:tcBorders>
+            <w:tcW w:type="dxa" w:w="2059"/>
             <w:shd w:fill="F7ECEC" w:color="auto" w:val="clear"/>
             <w:tcMar>
-              <w:top w:type="dxa" w:w="60"/>
-              <w:left w:type="dxa" w:w="100"/>
-              <w:bottom w:type="dxa" w:w="60"/>
-              <w:right w:type="dxa" w:w="100"/>
-            </w:tcMar>
-          </w:tcPr>
-          <w:p>
+              <w:top w:type="dxa" w:w="90"/>
+              <w:left w:type="dxa" w:w="110"/>
+              <w:bottom w:type="dxa" w:w="90"/>
+              <w:right w:type="dxa" w:w="110"/>
+            </w:tcMar>
+            <w:vAlign w:val="top"/>
+          </w:tcPr>
+          <w:p>
+            <w:pPr>
+              <w:spacing w:after="20"/>
+            </w:pPr>
             <w:r>
               <w:rPr>
                 <w:rFonts w:ascii="Calibri" w:cs="Calibri" w:eastAsia="Calibri" w:hAnsi="Calibri"/>
                 <w:b/>
                 <w:bCs/>
-                <w:color w:val="7A2626"/>
-                <w:sz w:val="22"/>
-                <w:szCs w:val="22"/>
+                <w:color w:val="1F2933"/>
+                <w:sz w:val="21"/>
+                <w:szCs w:val="21"/>
               </w:rPr>
               <w:t xml:space="preserve">Leave with</w:t>
             </w:r>
@@ -341,27 +310,27 @@
         </w:tc>
         <w:tc>
           <w:tcPr>
-            <w:tcW w:type="dxa" w:w="7488"/>
-            <w:tcBorders>
-              <w:top w:val="single" w:color="E2E2E2" w:sz="4"/>
-              <w:left w:val="single" w:color="E2E2E2" w:sz="4"/>
-              <w:bottom w:val="single" w:color="E2E2E2" w:sz="4"/>
-              <w:right w:val="single" w:color="E2E2E2" w:sz="4"/>
-            </w:tcBorders>
-            <w:tcMar>
-              <w:top w:type="dxa" w:w="60"/>
-              <w:left w:type="dxa" w:w="100"/>
-              <w:bottom w:type="dxa" w:w="60"/>
-              <w:right w:type="dxa" w:w="100"/>
-            </w:tcMar>
-          </w:tcPr>
-          <w:p>
-            <w:r>
-              <w:rPr>
-                <w:rFonts w:ascii="Calibri" w:cs="Calibri" w:eastAsia="Calibri" w:hAnsi="Calibri"/>
+            <w:tcW w:type="dxa" w:w="7301"/>
+            <w:tcMar>
+              <w:top w:type="dxa" w:w="90"/>
+              <w:left w:type="dxa" w:w="110"/>
+              <w:bottom w:type="dxa" w:w="90"/>
+              <w:right w:type="dxa" w:w="110"/>
+            </w:tcMar>
+            <w:vAlign w:val="top"/>
+          </w:tcPr>
+          <w:p>
+            <w:pPr>
+              <w:spacing w:after="20"/>
+            </w:pPr>
+            <w:r>
+              <w:rPr>
+                <w:rFonts w:ascii="Calibri" w:cs="Calibri" w:eastAsia="Calibri" w:hAnsi="Calibri"/>
+                <w:b w:val="false"/>
+                <w:bCs w:val="false"/>
                 <w:color w:val="1F2933"/>
-                <w:sz w:val="22"/>
-                <w:szCs w:val="22"/>
+                <w:sz w:val="21"/>
+                <w:szCs w:val="21"/>
               </w:rPr>
               <w:t xml:space="preserve">A finalized team foundation, confirmed complete against the Meetings 1–4 checklist.</w:t>
             </w:r>
@@ -371,7 +340,8 @@
     </w:tbl>
     <w:p>
       <w:pPr>
-        <w:spacing w:after="90" w:before="220"/>
+        <w:keepNext/>
+        <w:spacing w:after="80" w:before="200"/>
       </w:pPr>
       <w:r>
         <w:rPr>
@@ -379,8 +349,8 @@
           <w:b/>
           <w:bCs/>
           <w:color w:val="9B2C2C"/>
-          <w:sz w:val="26"/>
-          <w:szCs w:val="26"/>
+          <w:sz w:val="25"/>
+          <w:szCs w:val="25"/>
         </w:rPr>
         <w:t xml:space="preserve">Agenda — step by step</w:t>
       </w:r>
@@ -389,12 +359,12 @@
       <w:tblPr>
         <w:tblW w:type="dxa" w:w="9360"/>
         <w:tblBorders>
-          <w:top w:val="single" w:color="auto" w:sz="4"/>
-          <w:left w:val="single" w:color="auto" w:sz="4"/>
-          <w:bottom w:val="single" w:color="auto" w:sz="4"/>
-          <w:right w:val="single" w:color="auto" w:sz="4"/>
-          <w:insideH w:val="single" w:color="auto" w:sz="4"/>
-          <w:insideV w:val="single" w:color="auto" w:sz="4"/>
+          <w:top w:val="single" w:color="E5E7EB" w:sz="4"/>
+          <w:left w:val="single" w:color="E5E7EB" w:sz="4"/>
+          <w:bottom w:val="single" w:color="E5E7EB" w:sz="4"/>
+          <w:right w:val="single" w:color="E5E7EB" w:sz="4"/>
+          <w:insideH w:val="single" w:color="E5E7EB" w:sz="4"/>
+          <w:insideV w:val="single" w:color="E5E7EB" w:sz="4"/>
         </w:tblBorders>
       </w:tblPr>
       <w:tblGrid>
@@ -408,18 +378,12 @@
         <w:tc>
           <w:tcPr>
             <w:tcW w:type="dxa" w:w="1404"/>
-            <w:tcBorders>
-              <w:top w:val="single" w:color="E2E2E2" w:sz="4"/>
-              <w:left w:val="single" w:color="E2E2E2" w:sz="4"/>
-              <w:bottom w:val="single" w:color="E2E2E2" w:sz="4"/>
-              <w:right w:val="single" w:color="E2E2E2" w:sz="4"/>
-            </w:tcBorders>
             <w:shd w:fill="9B2C2C" w:color="auto" w:val="clear"/>
             <w:tcMar>
-              <w:top w:type="dxa" w:w="60"/>
-              <w:left w:type="dxa" w:w="100"/>
-              <w:bottom w:type="dxa" w:w="60"/>
-              <w:right w:type="dxa" w:w="100"/>
+              <w:top w:type="dxa" w:w="90"/>
+              <w:left w:type="dxa" w:w="110"/>
+              <w:bottom w:type="dxa" w:w="90"/>
+              <w:right w:type="dxa" w:w="110"/>
             </w:tcMar>
           </w:tcPr>
           <w:p>
@@ -439,18 +403,12 @@
         <w:tc>
           <w:tcPr>
             <w:tcW w:type="dxa" w:w="7956"/>
-            <w:tcBorders>
-              <w:top w:val="single" w:color="E2E2E2" w:sz="4"/>
-              <w:left w:val="single" w:color="E2E2E2" w:sz="4"/>
-              <w:bottom w:val="single" w:color="E2E2E2" w:sz="4"/>
-              <w:right w:val="single" w:color="E2E2E2" w:sz="4"/>
-            </w:tcBorders>
             <w:shd w:fill="9B2C2C" w:color="auto" w:val="clear"/>
             <w:tcMar>
-              <w:top w:type="dxa" w:w="60"/>
-              <w:left w:type="dxa" w:w="100"/>
-              <w:bottom w:type="dxa" w:w="60"/>
-              <w:right w:type="dxa" w:w="100"/>
+              <w:top w:type="dxa" w:w="90"/>
+              <w:left w:type="dxa" w:w="110"/>
+              <w:bottom w:type="dxa" w:w="90"/>
+              <w:right w:type="dxa" w:w="110"/>
             </w:tcMar>
           </w:tcPr>
           <w:p>
@@ -470,34 +428,32 @@
       </w:tr>
       <w:tr>
         <w:trPr>
-          <w:trHeight w:val="560" w:hRule="atLeast"/>
+          <w:cantSplit/>
         </w:trPr>
         <w:tc>
           <w:tcPr>
             <w:tcW w:type="dxa" w:w="1404"/>
-            <w:tcBorders>
-              <w:top w:val="single" w:color="E2E2E2" w:sz="4"/>
-              <w:left w:val="single" w:color="E2E2E2" w:sz="4"/>
-              <w:bottom w:val="single" w:color="E2E2E2" w:sz="4"/>
-              <w:right w:val="single" w:color="E2E2E2" w:sz="4"/>
-            </w:tcBorders>
             <w:shd w:fill="F7ECEC" w:color="auto" w:val="clear"/>
             <w:tcMar>
-              <w:top w:type="dxa" w:w="60"/>
-              <w:left w:type="dxa" w:w="100"/>
-              <w:bottom w:type="dxa" w:w="60"/>
-              <w:right w:type="dxa" w:w="100"/>
-            </w:tcMar>
-          </w:tcPr>
-          <w:p>
+              <w:top w:type="dxa" w:w="90"/>
+              <w:left w:type="dxa" w:w="110"/>
+              <w:bottom w:type="dxa" w:w="90"/>
+              <w:right w:type="dxa" w:w="110"/>
+            </w:tcMar>
+            <w:vAlign w:val="top"/>
+          </w:tcPr>
+          <w:p>
+            <w:pPr>
+              <w:spacing w:after="20"/>
+            </w:pPr>
             <w:r>
               <w:rPr>
                 <w:rFonts w:ascii="Calibri" w:cs="Calibri" w:eastAsia="Calibri" w:hAnsi="Calibri"/>
                 <w:b/>
                 <w:bCs/>
-                <w:color w:val="7A2626"/>
-                <w:sz w:val="22"/>
-                <w:szCs w:val="22"/>
+                <w:color w:val="1F2933"/>
+                <w:sz w:val="21"/>
+                <w:szCs w:val="21"/>
               </w:rPr>
               <w:t xml:space="preserve">0–5 min</w:t>
             </w:r>
@@ -506,62 +462,60 @@
         <w:tc>
           <w:tcPr>
             <w:tcW w:type="dxa" w:w="7956"/>
-            <w:tcBorders>
-              <w:top w:val="single" w:color="E2E2E2" w:sz="4"/>
-              <w:left w:val="single" w:color="E2E2E2" w:sz="4"/>
-              <w:bottom w:val="single" w:color="E2E2E2" w:sz="4"/>
-              <w:right w:val="single" w:color="E2E2E2" w:sz="4"/>
-            </w:tcBorders>
-            <w:tcMar>
-              <w:top w:type="dxa" w:w="60"/>
-              <w:left w:type="dxa" w:w="100"/>
-              <w:bottom w:type="dxa" w:w="60"/>
-              <w:right w:type="dxa" w:w="100"/>
-            </w:tcMar>
-          </w:tcPr>
-          <w:p>
-            <w:r>
-              <w:rPr>
-                <w:rFonts w:ascii="Calibri" w:cs="Calibri" w:eastAsia="Calibri" w:hAnsi="Calibri"/>
+            <w:tcMar>
+              <w:top w:type="dxa" w:w="90"/>
+              <w:left w:type="dxa" w:w="110"/>
+              <w:bottom w:type="dxa" w:w="90"/>
+              <w:right w:type="dxa" w:w="110"/>
+            </w:tcMar>
+            <w:vAlign w:val="top"/>
+          </w:tcPr>
+          <w:p>
+            <w:pPr>
+              <w:spacing w:after="20"/>
+            </w:pPr>
+            <w:r>
+              <w:rPr>
+                <w:rFonts w:ascii="Calibri" w:cs="Calibri" w:eastAsia="Calibri" w:hAnsi="Calibri"/>
+                <w:b w:val="false"/>
+                <w:bCs w:val="false"/>
                 <w:color w:val="1F2933"/>
-                <w:sz w:val="22"/>
-                <w:szCs w:val="22"/>
-              </w:rPr>
-              <w:t xml:space="preserve">Review norms and roles. Confirm who holds each role today and re-read your team norms together. Revisit anything unclear from Meetings 1–3. This pause is planned, not lost time.</w:t>
+                <w:sz w:val="21"/>
+                <w:szCs w:val="21"/>
+              </w:rPr>
+              <w:t xml:space="preserve">Review norms and roles. Confirm who holds each role today and re-read your team norms together. Revisit anything unclear from Meetings 1–3 — this pause is planned, not lost time.</w:t>
             </w:r>
           </w:p>
         </w:tc>
       </w:tr>
       <w:tr>
         <w:trPr>
-          <w:trHeight w:val="560" w:hRule="atLeast"/>
+          <w:cantSplit/>
         </w:trPr>
         <w:tc>
           <w:tcPr>
             <w:tcW w:type="dxa" w:w="1404"/>
-            <w:tcBorders>
-              <w:top w:val="single" w:color="E2E2E2" w:sz="4"/>
-              <w:left w:val="single" w:color="E2E2E2" w:sz="4"/>
-              <w:bottom w:val="single" w:color="E2E2E2" w:sz="4"/>
-              <w:right w:val="single" w:color="E2E2E2" w:sz="4"/>
-            </w:tcBorders>
             <w:shd w:fill="F7ECEC" w:color="auto" w:val="clear"/>
             <w:tcMar>
-              <w:top w:type="dxa" w:w="60"/>
-              <w:left w:type="dxa" w:w="100"/>
-              <w:bottom w:type="dxa" w:w="60"/>
-              <w:right w:type="dxa" w:w="100"/>
-            </w:tcMar>
-          </w:tcPr>
-          <w:p>
+              <w:top w:type="dxa" w:w="90"/>
+              <w:left w:type="dxa" w:w="110"/>
+              <w:bottom w:type="dxa" w:w="90"/>
+              <w:right w:type="dxa" w:w="110"/>
+            </w:tcMar>
+            <w:vAlign w:val="top"/>
+          </w:tcPr>
+          <w:p>
+            <w:pPr>
+              <w:spacing w:after="20"/>
+            </w:pPr>
             <w:r>
               <w:rPr>
                 <w:rFonts w:ascii="Calibri" w:cs="Calibri" w:eastAsia="Calibri" w:hAnsi="Calibri"/>
                 <w:b/>
                 <w:bCs/>
-                <w:color w:val="7A2626"/>
-                <w:sz w:val="22"/>
-                <w:szCs w:val="22"/>
+                <w:color w:val="1F2933"/>
+                <w:sz w:val="21"/>
+                <w:szCs w:val="21"/>
               </w:rPr>
               <w:t xml:space="preserve">5–25 min</w:t>
             </w:r>
@@ -570,26 +524,26 @@
         <w:tc>
           <w:tcPr>
             <w:tcW w:type="dxa" w:w="7956"/>
-            <w:tcBorders>
-              <w:top w:val="single" w:color="E2E2E2" w:sz="4"/>
-              <w:left w:val="single" w:color="E2E2E2" w:sz="4"/>
-              <w:bottom w:val="single" w:color="E2E2E2" w:sz="4"/>
-              <w:right w:val="single" w:color="E2E2E2" w:sz="4"/>
-            </w:tcBorders>
-            <w:tcMar>
-              <w:top w:type="dxa" w:w="60"/>
-              <w:left w:type="dxa" w:w="100"/>
-              <w:bottom w:type="dxa" w:w="60"/>
-              <w:right w:type="dxa" w:w="100"/>
-            </w:tcMar>
-          </w:tcPr>
-          <w:p>
-            <w:r>
-              <w:rPr>
-                <w:rFonts w:ascii="Calibri" w:cs="Calibri" w:eastAsia="Calibri" w:hAnsi="Calibri"/>
+            <w:tcMar>
+              <w:top w:type="dxa" w:w="90"/>
+              <w:left w:type="dxa" w:w="110"/>
+              <w:bottom w:type="dxa" w:w="90"/>
+              <w:right w:type="dxa" w:w="110"/>
+            </w:tcMar>
+            <w:vAlign w:val="top"/>
+          </w:tcPr>
+          <w:p>
+            <w:pPr>
+              <w:spacing w:after="20"/>
+            </w:pPr>
+            <w:r>
+              <w:rPr>
+                <w:rFonts w:ascii="Calibri" w:cs="Calibri" w:eastAsia="Calibri" w:hAnsi="Calibri"/>
+                <w:b w:val="false"/>
+                <w:bCs w:val="false"/>
                 <w:color w:val="1F2933"/>
-                <w:sz w:val="22"/>
-                <w:szCs w:val="22"/>
+                <w:sz w:val="21"/>
+                <w:szCs w:val="21"/>
               </w:rPr>
               <w:t xml:space="preserve">Finalize your team foundation. Refine the roles and norms you drafted in Meeting 2, and complete the Holding Each Other Accountable worksheet if it was a first pass. This locks in how you'll work before content begins.</w:t>
             </w:r>
@@ -598,34 +552,32 @@
       </w:tr>
       <w:tr>
         <w:trPr>
-          <w:trHeight w:val="560" w:hRule="atLeast"/>
+          <w:cantSplit/>
         </w:trPr>
         <w:tc>
           <w:tcPr>
             <w:tcW w:type="dxa" w:w="1404"/>
-            <w:tcBorders>
-              <w:top w:val="single" w:color="E2E2E2" w:sz="4"/>
-              <w:left w:val="single" w:color="E2E2E2" w:sz="4"/>
-              <w:bottom w:val="single" w:color="E2E2E2" w:sz="4"/>
-              <w:right w:val="single" w:color="E2E2E2" w:sz="4"/>
-            </w:tcBorders>
             <w:shd w:fill="F7ECEC" w:color="auto" w:val="clear"/>
             <w:tcMar>
-              <w:top w:type="dxa" w:w="60"/>
-              <w:left w:type="dxa" w:w="100"/>
-              <w:bottom w:type="dxa" w:w="60"/>
-              <w:right w:type="dxa" w:w="100"/>
-            </w:tcMar>
-          </w:tcPr>
-          <w:p>
+              <w:top w:type="dxa" w:w="90"/>
+              <w:left w:type="dxa" w:w="110"/>
+              <w:bottom w:type="dxa" w:w="90"/>
+              <w:right w:type="dxa" w:w="110"/>
+            </w:tcMar>
+            <w:vAlign w:val="top"/>
+          </w:tcPr>
+          <w:p>
+            <w:pPr>
+              <w:spacing w:after="20"/>
+            </w:pPr>
             <w:r>
               <w:rPr>
                 <w:rFonts w:ascii="Calibri" w:cs="Calibri" w:eastAsia="Calibri" w:hAnsi="Calibri"/>
                 <w:b/>
                 <w:bCs/>
-                <w:color w:val="7A2626"/>
-                <w:sz w:val="22"/>
-                <w:szCs w:val="22"/>
+                <w:color w:val="1F2933"/>
+                <w:sz w:val="21"/>
+                <w:szCs w:val="21"/>
               </w:rPr>
               <w:t xml:space="preserve">25–40 min</w:t>
             </w:r>
@@ -634,62 +586,60 @@
         <w:tc>
           <w:tcPr>
             <w:tcW w:type="dxa" w:w="7956"/>
-            <w:tcBorders>
-              <w:top w:val="single" w:color="E2E2E2" w:sz="4"/>
-              <w:left w:val="single" w:color="E2E2E2" w:sz="4"/>
-              <w:bottom w:val="single" w:color="E2E2E2" w:sz="4"/>
-              <w:right w:val="single" w:color="E2E2E2" w:sz="4"/>
-            </w:tcBorders>
-            <w:tcMar>
-              <w:top w:type="dxa" w:w="60"/>
-              <w:left w:type="dxa" w:w="100"/>
-              <w:bottom w:type="dxa" w:w="60"/>
-              <w:right w:type="dxa" w:w="100"/>
-            </w:tcMar>
-          </w:tcPr>
-          <w:p>
-            <w:r>
-              <w:rPr>
-                <w:rFonts w:ascii="Calibri" w:cs="Calibri" w:eastAsia="Calibri" w:hAnsi="Calibri"/>
+            <w:tcMar>
+              <w:top w:type="dxa" w:w="90"/>
+              <w:left w:type="dxa" w:w="110"/>
+              <w:bottom w:type="dxa" w:w="90"/>
+              <w:right w:type="dxa" w:w="110"/>
+            </w:tcMar>
+            <w:vAlign w:val="top"/>
+          </w:tcPr>
+          <w:p>
+            <w:pPr>
+              <w:spacing w:after="20"/>
+            </w:pPr>
+            <w:r>
+              <w:rPr>
+                <w:rFonts w:ascii="Calibri" w:cs="Calibri" w:eastAsia="Calibri" w:hAnsi="Calibri"/>
+                <w:b w:val="false"/>
+                <w:bCs w:val="false"/>
                 <w:color w:val="1F2933"/>
-                <w:sz w:val="22"/>
-                <w:szCs w:val="22"/>
-              </w:rPr>
-              <w:t xml:space="preserve">Work the readiness checklist. Using the checklist on the back of this agenda, check off every task from Meetings 1–4. Use any remaining time to close the gaps — finishing anything that isn't done yet is exactly what this buffer meeting is for.</w:t>
+                <w:sz w:val="21"/>
+                <w:szCs w:val="21"/>
+              </w:rPr>
+              <w:t xml:space="preserve">Work the readiness checklist. Using the checklist on the back of this agenda, check off every task from Meetings 1–4. Use any remaining time to close the gaps — finishing anything that isn't done yet is exactly what this buffer is for.</w:t>
             </w:r>
           </w:p>
         </w:tc>
       </w:tr>
       <w:tr>
         <w:trPr>
-          <w:trHeight w:val="560" w:hRule="atLeast"/>
+          <w:cantSplit/>
         </w:trPr>
         <w:tc>
           <w:tcPr>
             <w:tcW w:type="dxa" w:w="1404"/>
-            <w:tcBorders>
-              <w:top w:val="single" w:color="E2E2E2" w:sz="4"/>
-              <w:left w:val="single" w:color="E2E2E2" w:sz="4"/>
-              <w:bottom w:val="single" w:color="E2E2E2" w:sz="4"/>
-              <w:right w:val="single" w:color="E2E2E2" w:sz="4"/>
-            </w:tcBorders>
             <w:shd w:fill="F7ECEC" w:color="auto" w:val="clear"/>
             <w:tcMar>
-              <w:top w:type="dxa" w:w="60"/>
-              <w:left w:type="dxa" w:w="100"/>
-              <w:bottom w:type="dxa" w:w="60"/>
-              <w:right w:type="dxa" w:w="100"/>
-            </w:tcMar>
-          </w:tcPr>
-          <w:p>
+              <w:top w:type="dxa" w:w="90"/>
+              <w:left w:type="dxa" w:w="110"/>
+              <w:bottom w:type="dxa" w:w="90"/>
+              <w:right w:type="dxa" w:w="110"/>
+            </w:tcMar>
+            <w:vAlign w:val="top"/>
+          </w:tcPr>
+          <w:p>
+            <w:pPr>
+              <w:spacing w:after="20"/>
+            </w:pPr>
             <w:r>
               <w:rPr>
                 <w:rFonts w:ascii="Calibri" w:cs="Calibri" w:eastAsia="Calibri" w:hAnsi="Calibri"/>
                 <w:b/>
                 <w:bCs/>
-                <w:color w:val="7A2626"/>
-                <w:sz w:val="22"/>
-                <w:szCs w:val="22"/>
+                <w:color w:val="1F2933"/>
+                <w:sz w:val="21"/>
+                <w:szCs w:val="21"/>
               </w:rPr>
               <w:t xml:space="preserve">40–45 min</w:t>
             </w:r>
@@ -698,26 +648,26 @@
         <w:tc>
           <w:tcPr>
             <w:tcW w:type="dxa" w:w="7956"/>
-            <w:tcBorders>
-              <w:top w:val="single" w:color="E2E2E2" w:sz="4"/>
-              <w:left w:val="single" w:color="E2E2E2" w:sz="4"/>
-              <w:bottom w:val="single" w:color="E2E2E2" w:sz="4"/>
-              <w:right w:val="single" w:color="E2E2E2" w:sz="4"/>
-            </w:tcBorders>
-            <w:tcMar>
-              <w:top w:type="dxa" w:w="60"/>
-              <w:left w:type="dxa" w:w="100"/>
-              <w:bottom w:type="dxa" w:w="60"/>
-              <w:right w:type="dxa" w:w="100"/>
-            </w:tcMar>
-          </w:tcPr>
-          <w:p>
-            <w:r>
-              <w:rPr>
-                <w:rFonts w:ascii="Calibri" w:cs="Calibri" w:eastAsia="Calibri" w:hAnsi="Calibri"/>
+            <w:tcMar>
+              <w:top w:type="dxa" w:w="90"/>
+              <w:left w:type="dxa" w:w="110"/>
+              <w:bottom w:type="dxa" w:w="90"/>
+              <w:right w:type="dxa" w:w="110"/>
+            </w:tcMar>
+            <w:vAlign w:val="top"/>
+          </w:tcPr>
+          <w:p>
+            <w:pPr>
+              <w:spacing w:after="20"/>
+            </w:pPr>
+            <w:r>
+              <w:rPr>
+                <w:rFonts w:ascii="Calibri" w:cs="Calibri" w:eastAsia="Calibri" w:hAnsi="Calibri"/>
+                <w:b w:val="false"/>
+                <w:bCs w:val="false"/>
                 <w:color w:val="1F2933"/>
-                <w:sz w:val="22"/>
-                <w:szCs w:val="22"/>
+                <w:sz w:val="21"/>
+                <w:szCs w:val="21"/>
               </w:rPr>
               <w:t xml:space="preserve">Assign pre-work. Decide what standards and materials everyone brings to Meeting 5, where the standards work begins.</w:t>
             </w:r>
@@ -727,84 +677,217 @@
     </w:tbl>
     <w:p>
       <w:pPr>
-        <w:spacing w:before="140"/>
-      </w:pPr>
-      <w:r>
-        <w:rPr>
-          <w:rFonts w:ascii="Calibri" w:cs="Calibri" w:eastAsia="Calibri" w:hAnsi="Calibri"/>
-        </w:rPr>
-        <w:t xml:space="preserve"/>
-      </w:r>
-    </w:p>
-    <w:tbl>
-      <w:tblPr>
-        <w:tblW w:type="dxa" w:w="9360"/>
-        <w:tblBorders>
-          <w:top w:val="single" w:color="auto" w:sz="4"/>
-          <w:left w:val="single" w:color="auto" w:sz="4"/>
-          <w:bottom w:val="single" w:color="auto" w:sz="4"/>
-          <w:right w:val="single" w:color="auto" w:sz="4"/>
-          <w:insideH w:val="single" w:color="auto" w:sz="4"/>
-          <w:insideV w:val="single" w:color="auto" w:sz="4"/>
-        </w:tblBorders>
-      </w:tblPr>
-      <w:tblGrid>
-        <w:gridCol w:w="9360"/>
-      </w:tblGrid>
-      <w:tr>
-        <w:tc>
-          <w:tcPr>
-            <w:tcW w:type="dxa" w:w="9360"/>
-            <w:tcBorders>
-              <w:top w:val="single" w:color="E0A99F" w:sz="8"/>
-              <w:left w:val="single" w:color="E0A99F" w:sz="8"/>
-              <w:bottom w:val="single" w:color="E0A99F" w:sz="8"/>
-              <w:right w:val="single" w:color="E0A99F" w:sz="8"/>
-            </w:tcBorders>
-            <w:shd w:fill="FDF3EF" w:color="auto" w:val="clear"/>
-            <w:tcMar>
-              <w:top w:type="dxa" w:w="120"/>
-              <w:left w:type="dxa" w:w="160"/>
-              <w:bottom w:type="dxa" w:w="120"/>
-              <w:right w:type="dxa" w:w="160"/>
-            </w:tcMar>
-          </w:tcPr>
-          <w:p>
-            <w:pPr>
-              <w:spacing w:after="30"/>
-            </w:pPr>
-            <w:r>
-              <w:rPr>
-                <w:rFonts w:ascii="Calibri" w:cs="Calibri" w:eastAsia="Calibri" w:hAnsi="Calibri"/>
-                <w:b/>
-                <w:bCs/>
-                <w:color w:val="9B2C2C"/>
-                <w:sz w:val="24"/>
-                <w:szCs w:val="24"/>
-              </w:rPr>
-              <w:t xml:space="preserve">Where we're going next → Meeting 5</w:t>
-            </w:r>
-          </w:p>
-          <w:p>
-            <w:r>
-              <w:rPr>
-                <w:rFonts w:ascii="Calibri" w:cs="Calibri" w:eastAsia="Calibri" w:hAnsi="Calibri"/>
-                <w:color w:val="1F2933"/>
-                <w:sz w:val="22"/>
-                <w:szCs w:val="22"/>
-              </w:rPr>
-              <w:t xml:space="preserve">Identifying Essential Standards — PLC Question 1: What do we want students to learn?</w:t>
-            </w:r>
-          </w:p>
-        </w:tc>
-      </w:tr>
-    </w:tbl>
+        <w:shd w:fill="F7ECEC" w:color="auto" w:val="clear"/>
+        <w:spacing w:after="120" w:before="120"/>
+      </w:pPr>
+      <w:r>
+        <w:rPr>
+          <w:rFonts w:ascii="Calibri" w:cs="Calibri" w:eastAsia="Calibri" w:hAnsi="Calibri"/>
+          <w:color w:val="1F2933"/>
+          <w:sz w:val="21"/>
+          <w:szCs w:val="21"/>
+        </w:rPr>
+        <w:t xml:space="preserve">Where we're going next → Meeting 5: Identifying Essential Standards. You'll choose the one essential standard your team will guarantee this cycle (PLC Question 1: What do we want students to learn?).</w:t>
+      </w:r>
+    </w:p>
+    <w:p>
+      <w:pPr>
+        <w:pageBreakBefore/>
+      </w:pPr>
+    </w:p>
+    <w:p>
+      <w:pPr>
+        <w:keepNext/>
+        <w:spacing w:after="80" w:before="200"/>
+      </w:pPr>
+      <w:r>
+        <w:rPr>
+          <w:rFonts w:ascii="Calibri" w:cs="Calibri" w:eastAsia="Calibri" w:hAnsi="Calibri"/>
+          <w:b/>
+          <w:bCs/>
+          <w:color w:val="9B2C2C"/>
+          <w:sz w:val="25"/>
+          <w:szCs w:val="25"/>
+        </w:rPr>
+        <w:t xml:space="preserve">Meeting 4 readiness checklist — are we ready to move on?</w:t>
+      </w:r>
+    </w:p>
+    <w:p>
+      <w:pPr>
+        <w:spacing w:after="120"/>
+      </w:pPr>
+      <w:r>
+        <w:rPr>
+          <w:rFonts w:ascii="Calibri" w:cs="Calibri" w:eastAsia="Calibri" w:hAnsi="Calibri"/>
+          <w:color w:val="1F2933"/>
+          <w:sz w:val="22"/>
+          <w:szCs w:val="22"/>
+        </w:rPr>
+        <w:t xml:space="preserve">Complete this before the standards work begins at Meeting 5. Meeting 4 is a reset — a chance to finish anything from Meetings 1–4 that isn't done yet and make sure the team is ready for the first big chunk of content work: Clarifying Essential Learning.</w:t>
+      </w:r>
+    </w:p>
+    <w:p>
+      <w:pPr>
+        <w:spacing w:after="120"/>
+      </w:pPr>
+      <w:r>
+        <w:rPr>
+          <w:rFonts w:ascii="Calibri" w:cs="Calibri" w:eastAsia="Calibri" w:hAnsi="Calibri"/>
+          <w:b/>
+          <w:bCs/>
+          <w:color w:val="1F2933"/>
+          <w:sz w:val="22"/>
+          <w:szCs w:val="22"/>
+        </w:rPr>
+        <w:t xml:space="preserve">Before the standards work begins, our team has:</w:t>
+      </w:r>
+    </w:p>
+    <w:p>
+      <w:pPr>
+        <w:spacing w:after="120"/>
+      </w:pPr>
+      <w:r>
+        <w:rPr>
+          <w:rFonts w:ascii="Calibri" w:cs="Calibri" w:eastAsia="Calibri" w:hAnsi="Calibri"/>
+          <w:color w:val="1F2933"/>
+          <w:sz w:val="24"/>
+          <w:szCs w:val="24"/>
+        </w:rPr>
+        <w:t xml:space="preserve">☐   </w:t>
+      </w:r>
+      <w:r>
+        <w:rPr>
+          <w:rFonts w:ascii="Calibri" w:cs="Calibri" w:eastAsia="Calibri" w:hAnsi="Calibri"/>
+          <w:b/>
+          <w:bCs/>
+          <w:color w:val="1F2933"/>
+          <w:sz w:val="22"/>
+          <w:szCs w:val="22"/>
+        </w:rPr>
+        <w:t xml:space="preserve">A shared understanding of why the PLC process matters — why we're doing this work (Meeting 1)</w:t>
+      </w:r>
+    </w:p>
+    <w:p>
+      <w:pPr>
+        <w:spacing w:after="120"/>
+      </w:pPr>
+      <w:r>
+        <w:rPr>
+          <w:rFonts w:ascii="Calibri" w:cs="Calibri" w:eastAsia="Calibri" w:hAnsi="Calibri"/>
+          <w:color w:val="1F2933"/>
+          <w:sz w:val="24"/>
+          <w:szCs w:val="24"/>
+        </w:rPr>
+        <w:t xml:space="preserve">☐   </w:t>
+      </w:r>
+      <w:r>
+        <w:rPr>
+          <w:rFonts w:ascii="Calibri" w:cs="Calibri" w:eastAsia="Calibri" w:hAnsi="Calibri"/>
+          <w:b/>
+          <w:bCs/>
+          <w:color w:val="1F2933"/>
+          <w:sz w:val="22"/>
+          <w:szCs w:val="22"/>
+        </w:rPr>
+        <w:t xml:space="preserve">Team roles assigned, with backups (Meetings 2 &amp; 4)</w:t>
+      </w:r>
+    </w:p>
+    <w:p>
+      <w:pPr>
+        <w:spacing w:after="120"/>
+      </w:pPr>
+      <w:r>
+        <w:rPr>
+          <w:rFonts w:ascii="Calibri" w:cs="Calibri" w:eastAsia="Calibri" w:hAnsi="Calibri"/>
+          <w:color w:val="1F2933"/>
+          <w:sz w:val="24"/>
+          <w:szCs w:val="24"/>
+        </w:rPr>
+        <w:t xml:space="preserve">☐   </w:t>
+      </w:r>
+      <w:r>
+        <w:rPr>
+          <w:rFonts w:ascii="Calibri" w:cs="Calibri" w:eastAsia="Calibri" w:hAnsi="Calibri"/>
+          <w:b/>
+          <w:bCs/>
+          <w:color w:val="1F2933"/>
+          <w:sz w:val="22"/>
+          <w:szCs w:val="22"/>
+        </w:rPr>
+        <w:t xml:space="preserve">Specific, observable “We will…” norms (Meeting 2)</w:t>
+      </w:r>
+    </w:p>
+    <w:p>
+      <w:pPr>
+        <w:spacing w:after="120"/>
+      </w:pPr>
+      <w:r>
+        <w:rPr>
+          <w:rFonts w:ascii="Calibri" w:cs="Calibri" w:eastAsia="Calibri" w:hAnsi="Calibri"/>
+          <w:color w:val="1F2933"/>
+          <w:sz w:val="24"/>
+          <w:szCs w:val="24"/>
+        </w:rPr>
+        <w:t xml:space="preserve">☐   </w:t>
+      </w:r>
+      <w:r>
+        <w:rPr>
+          <w:rFonts w:ascii="Calibri" w:cs="Calibri" w:eastAsia="Calibri" w:hAnsi="Calibri"/>
+          <w:b/>
+          <w:bCs/>
+          <w:color w:val="1F2933"/>
+          <w:sz w:val="22"/>
+          <w:szCs w:val="22"/>
+        </w:rPr>
+        <w:t xml:space="preserve">An agreed way to hold each other accountable (Meetings 2 &amp; 4)</w:t>
+      </w:r>
+    </w:p>
+    <w:p>
+      <w:pPr>
+        <w:spacing w:after="120"/>
+      </w:pPr>
+      <w:r>
+        <w:rPr>
+          <w:rFonts w:ascii="Calibri" w:cs="Calibri" w:eastAsia="Calibri" w:hAnsi="Calibri"/>
+          <w:color w:val="1F2933"/>
+          <w:sz w:val="24"/>
+          <w:szCs w:val="24"/>
+        </w:rPr>
+        <w:t xml:space="preserve">☐   </w:t>
+      </w:r>
+      <w:r>
+        <w:rPr>
+          <w:rFonts w:ascii="Calibri" w:cs="Calibri" w:eastAsia="Calibri" w:hAnsi="Calibri"/>
+          <w:b/>
+          <w:bCs/>
+          <w:color w:val="1F2933"/>
+          <w:sz w:val="22"/>
+          <w:szCs w:val="22"/>
+        </w:rPr>
+        <w:t xml:space="preserve">A Collaborative Team Rubric baseline and one growth focus (Meeting 3)</w:t>
+      </w:r>
+    </w:p>
+    <w:p>
+      <w:pPr>
+        <w:shd w:fill="F7ECEC" w:color="auto" w:val="clear"/>
+        <w:spacing w:after="120" w:before="120"/>
+      </w:pPr>
+      <w:r>
+        <w:rPr>
+          <w:rFonts w:ascii="Calibri" w:cs="Calibri" w:eastAsia="Calibri" w:hAnsi="Calibri"/>
+          <w:color w:val="1F2933"/>
+          <w:sz w:val="21"/>
+          <w:szCs w:val="21"/>
+        </w:rPr>
+        <w:t xml:space="preserve">If every box is checked, the team is ready to begin Clarifying Essential Learning at Meeting 5. If not, use the rest of Meeting 4 to close the gap — that's what this buffer meeting is for.</w:t>
+      </w:r>
+    </w:p>
     <w:p>
       <w:pPr>
         <w:pBdr>
-          <w:top w:val="single" w:color="E2E2E2" w:sz="4" w:space="8"/>
+          <w:top w:val="single" w:color="E5E7EB" w:sz="4" w:space="6"/>
         </w:pBdr>
-        <w:spacing w:before="180"/>
+        <w:spacing w:before="200"/>
       </w:pPr>
       <w:r>
         <w:rPr>
@@ -812,15 +895,15 @@
           <w:i/>
           <w:iCs/>
           <w:color w:val="64748B"/>
-          <w:sz w:val="15"/>
-          <w:szCs w:val="15"/>
-        </w:rPr>
-        <w:t xml:space="preserve">Elsinore Middle School Professional Learning Teams · 2026–27 · Meeting 4 agenda.</w:t>
+          <w:sz w:val="18"/>
+          <w:szCs w:val="18"/>
+        </w:rPr>
+        <w:t xml:space="preserve">Elsinore Middle School Professional Learning Teams · 2026–27 · Meeting 4 agenda + readiness checklist.</w:t>
       </w:r>
     </w:p>
     <w:sectPr>
       <w:pgSz w:w="12240" w:h="15840" w:orient="portrait"/>
-      <w:pgMar w:top="900" w:right="1440" w:bottom="900" w:left="1440" w:header="708" w:footer="708" w:gutter="0"/>
+      <w:pgMar w:top="864" w:right="864" w:bottom="864" w:left="864" w:header="708" w:footer="708" w:gutter="0"/>
       <w:pgNumType/>
       <w:docGrid w:linePitch="360"/>
     </w:sectPr>
@@ -1004,12 +1087,7 @@
 <file path=word/styles.xml><?xml version="1.0" encoding="utf-8"?>
 <w:styles xmlns:mc="http://schemas.openxmlformats.org/markup-compatibility/2006" xmlns:r="http://schemas.openxmlformats.org/officeDocument/2006/relationships" xmlns:w="http://schemas.openxmlformats.org/wordprocessingml/2006/main" xmlns:w14="http://schemas.microsoft.com/office/word/2010/wordml" xmlns:w15="http://schemas.microsoft.com/office/word/2012/wordml" mc:Ignorable="w14 w15">
   <w:docDefaults>
-    <w:rPrDefault>
-      <w:rPr>
-        <w:rFonts w:ascii="Calibri" w:cs="Calibri" w:eastAsia="Calibri" w:hAnsi="Calibri"/>
-        <w:color w:val="1F2933"/>
-      </w:rPr>
-    </w:rPrDefault>
+    <w:rPrDefault/>
     <w:pPrDefault/>
   </w:docDefaults>
   <w:style w:type="paragraph" w:styleId="Title">

</xml_diff>